<commit_message>
Agregando diagrama de clases actualizado
</commit_message>
<xml_diff>
--- a/docs/Taller practico.docx
+++ b/docs/Taller practico.docx
@@ -1512,27 +1512,7 @@
           <w:sz w:val="20"/>
           <w:szCs w:val="20"/>
         </w:rPr>
-        <w:t xml:space="preserve">en su totalidad de la otra clase, por </w:t>
-      </w:r>
-      <w:proofErr w:type="gramStart"/>
-      <w:r>
-        <w:rPr>
-          <w:rFonts w:ascii="Aptos" w:eastAsia="Aptos" w:hAnsi="Aptos" w:cs="Aptos"/>
-          <w:color w:val="202122"/>
-          <w:sz w:val="20"/>
-          <w:szCs w:val="20"/>
-        </w:rPr>
-        <w:t>ende</w:t>
-      </w:r>
-      <w:proofErr w:type="gramEnd"/>
-      <w:r>
-        <w:rPr>
-          <w:rFonts w:ascii="Aptos" w:eastAsia="Aptos" w:hAnsi="Aptos" w:cs="Aptos"/>
-          <w:color w:val="202122"/>
-          <w:sz w:val="20"/>
-          <w:szCs w:val="20"/>
-        </w:rPr>
-        <w:t xml:space="preserve"> se utiliza la relación de composición</w:t>
+        <w:t>en su totalidad de la otra clase, por ende se utiliza la relación de composición</w:t>
       </w:r>
     </w:p>
     <w:p>
@@ -3260,27 +3240,7 @@
           <w:sz w:val="18"/>
           <w:szCs w:val="18"/>
         </w:rPr>
-        <w:t xml:space="preserve">    void </w:t>
-      </w:r>
-      <w:proofErr w:type="gramStart"/>
-      <w:r>
-        <w:rPr>
-          <w:rFonts w:ascii="Consolas" w:eastAsia="Consolas" w:hAnsi="Consolas" w:cs="Consolas"/>
-          <w:color w:val="202122"/>
-          <w:sz w:val="18"/>
-          <w:szCs w:val="18"/>
-        </w:rPr>
-        <w:t>notificar(</w:t>
-      </w:r>
-      <w:proofErr w:type="gramEnd"/>
-      <w:r>
-        <w:rPr>
-          <w:rFonts w:ascii="Consolas" w:eastAsia="Consolas" w:hAnsi="Consolas" w:cs="Consolas"/>
-          <w:color w:val="202122"/>
-          <w:sz w:val="18"/>
-          <w:szCs w:val="18"/>
-        </w:rPr>
-        <w:t>String mensaje);</w:t>
+        <w:t xml:space="preserve">    void notificar(String mensaje);</w:t>
       </w:r>
       <w:r>
         <w:br/>
@@ -4286,29 +4246,7 @@
                 <w:szCs w:val="20"/>
                 <w:lang w:eastAsia="es-CO"/>
               </w:rPr>
-              <w:t xml:space="preserve"> Usuario, Estudiante, Bibliotecario, </w:t>
-            </w:r>
-            <w:proofErr w:type="spellStart"/>
-            <w:r>
-              <w:rPr>
-                <w:rFonts w:ascii="Aptos" w:eastAsia="Times New Roman" w:hAnsi="Aptos" w:cs="Segoe UI"/>
-                <w:color w:val="202122"/>
-                <w:sz w:val="20"/>
-                <w:szCs w:val="20"/>
-                <w:lang w:eastAsia="es-CO"/>
-              </w:rPr>
-              <w:t>Notificable</w:t>
-            </w:r>
-            <w:proofErr w:type="spellEnd"/>
-            <w:r>
-              <w:rPr>
-                <w:rFonts w:ascii="Aptos" w:eastAsia="Times New Roman" w:hAnsi="Aptos" w:cs="Segoe UI"/>
-                <w:color w:val="202122"/>
-                <w:sz w:val="20"/>
-                <w:szCs w:val="20"/>
-                <w:lang w:eastAsia="es-CO"/>
-              </w:rPr>
-              <w:t> </w:t>
+              <w:t> Usuario, Estudiante, Bibliotecario, Notificable </w:t>
             </w:r>
           </w:p>
         </w:tc>
@@ -4528,51 +4466,7 @@
                 <w:szCs w:val="20"/>
                 <w:lang w:eastAsia="es-CO"/>
               </w:rPr>
-              <w:t> </w:t>
-            </w:r>
-            <w:proofErr w:type="spellStart"/>
-            <w:r>
-              <w:rPr>
-                <w:rFonts w:ascii="Aptos" w:eastAsia="Times New Roman" w:hAnsi="Aptos" w:cs="Segoe UI"/>
-                <w:color w:val="202122"/>
-                <w:sz w:val="20"/>
-                <w:szCs w:val="20"/>
-                <w:lang w:eastAsia="es-CO"/>
-              </w:rPr>
-              <w:t>Prestamo</w:t>
-            </w:r>
-            <w:proofErr w:type="spellEnd"/>
-            <w:r>
-              <w:rPr>
-                <w:rFonts w:ascii="Aptos" w:eastAsia="Times New Roman" w:hAnsi="Aptos" w:cs="Segoe UI"/>
-                <w:color w:val="202122"/>
-                <w:sz w:val="20"/>
-                <w:szCs w:val="20"/>
-                <w:lang w:eastAsia="es-CO"/>
-              </w:rPr>
-              <w:t xml:space="preserve">, </w:t>
-            </w:r>
-            <w:proofErr w:type="spellStart"/>
-            <w:r>
-              <w:rPr>
-                <w:rFonts w:ascii="Aptos" w:eastAsia="Times New Roman" w:hAnsi="Aptos" w:cs="Segoe UI"/>
-                <w:color w:val="202122"/>
-                <w:sz w:val="20"/>
-                <w:szCs w:val="20"/>
-                <w:lang w:eastAsia="es-CO"/>
-              </w:rPr>
-              <w:t>Renovacion</w:t>
-            </w:r>
-            <w:proofErr w:type="spellEnd"/>
-            <w:r>
-              <w:rPr>
-                <w:rFonts w:ascii="Aptos" w:eastAsia="Times New Roman" w:hAnsi="Aptos" w:cs="Segoe UI"/>
-                <w:color w:val="202122"/>
-                <w:sz w:val="20"/>
-                <w:szCs w:val="20"/>
-                <w:lang w:eastAsia="es-CO"/>
-              </w:rPr>
-              <w:t xml:space="preserve"> </w:t>
+              <w:t xml:space="preserve"> Prestamo, Renovacion </w:t>
             </w:r>
           </w:p>
         </w:tc>
@@ -4877,6 +4771,88 @@
       </w:tr>
     </w:tbl>
     <w:p/>
+    <w:p>
+      <w:pPr>
+        <w:pStyle w:val="Ttulo1"/>
+      </w:pPr>
+      <w:r>
+        <w:t>Diagrama de clases actualizado</w:t>
+      </w:r>
+    </w:p>
+    <w:p>
+      <w:pPr>
+        <w:spacing w:after="0" w:line="240" w:lineRule="auto"/>
+        <w:rPr>
+          <w:rFonts w:ascii="Times New Roman" w:eastAsia="Times New Roman" w:hAnsi="Times New Roman" w:cs="Times New Roman"/>
+          <w:lang w:val="es-CO" w:eastAsia="es-CO"/>
+        </w:rPr>
+      </w:pPr>
+      <w:r>
+        <w:rPr>
+          <w:rFonts w:ascii="Times New Roman" w:eastAsia="Times New Roman" w:hAnsi="Times New Roman" w:cs="Times New Roman"/>
+          <w:noProof/>
+          <w:lang w:val="es-CO" w:eastAsia="es-CO"/>
+        </w:rPr>
+        <w:drawing>
+          <wp:inline distT="0" distB="0" distL="0" distR="0" wp14:anchorId="68746550" wp14:editId="1143F17E">
+            <wp:extent cx="5731510" cy="1974215"/>
+            <wp:effectExtent l="0" t="0" r="2540" b="6985"/>
+            <wp:docPr id="1" name="Imagen 1"/>
+            <wp:cNvGraphicFramePr>
+              <a:graphicFrameLocks xmlns:a="http://schemas.openxmlformats.org/drawingml/2006/main" noChangeAspect="1"/>
+            </wp:cNvGraphicFramePr>
+            <a:graphic xmlns:a="http://schemas.openxmlformats.org/drawingml/2006/main">
+              <a:graphicData uri="http://schemas.openxmlformats.org/drawingml/2006/picture">
+                <pic:pic xmlns:pic="http://schemas.openxmlformats.org/drawingml/2006/picture">
+                  <pic:nvPicPr>
+                    <pic:cNvPr id="0" name="Picture 1"/>
+                    <pic:cNvPicPr>
+                      <a:picLocks noChangeAspect="1" noChangeArrowheads="1"/>
+                    </pic:cNvPicPr>
+                  </pic:nvPicPr>
+                  <pic:blipFill>
+                    <a:blip r:embed="rId7" cstate="print">
+                      <a:extLst>
+                        <a:ext uri="{28A0092B-C50C-407E-A947-70E740481C1C}">
+                          <a14:useLocalDpi xmlns:a14="http://schemas.microsoft.com/office/drawing/2010/main" val="0"/>
+                        </a:ext>
+                      </a:extLst>
+                    </a:blip>
+                    <a:srcRect/>
+                    <a:stretch>
+                      <a:fillRect/>
+                    </a:stretch>
+                  </pic:blipFill>
+                  <pic:spPr bwMode="auto">
+                    <a:xfrm>
+                      <a:off x="0" y="0"/>
+                      <a:ext cx="5731510" cy="1974215"/>
+                    </a:xfrm>
+                    <a:prstGeom prst="rect">
+                      <a:avLst/>
+                    </a:prstGeom>
+                    <a:noFill/>
+                    <a:ln>
+                      <a:noFill/>
+                    </a:ln>
+                  </pic:spPr>
+                </pic:pic>
+              </a:graphicData>
+            </a:graphic>
+          </wp:inline>
+        </w:drawing>
+      </w:r>
+    </w:p>
+    <w:p/>
+    <w:p>
+      <w:pPr>
+        <w:pStyle w:val="Ttulo1"/>
+      </w:pPr>
+      <w:r>
+        <w:lastRenderedPageBreak/>
+        <w:t>Diagrama de componentes</w:t>
+      </w:r>
+    </w:p>
     <w:sectPr>
       <w:pgSz w:w="11906" w:h="16838"/>
       <w:pgMar w:top="1440" w:right="1440" w:bottom="1440" w:left="1440" w:header="720" w:footer="720" w:gutter="0"/>
@@ -5514,6 +5490,7 @@
     <w:lsdException w:name="HTML Sample" w:semiHidden="1" w:unhideWhenUsed="1"/>
     <w:lsdException w:name="HTML Typewriter" w:semiHidden="1" w:unhideWhenUsed="1"/>
     <w:lsdException w:name="HTML Variable" w:semiHidden="1" w:unhideWhenUsed="1"/>
+    <w:lsdException w:name="Normal Table" w:semiHidden="1" w:unhideWhenUsed="1"/>
     <w:lsdException w:name="annotation subject" w:semiHidden="1" w:unhideWhenUsed="1"/>
     <w:lsdException w:name="No List" w:semiHidden="1" w:unhideWhenUsed="1"/>
     <w:lsdException w:name="Outline List 1" w:semiHidden="1" w:unhideWhenUsed="1"/>
@@ -5556,8 +5533,11 @@
     <w:lsdException w:name="Table Contemporary" w:semiHidden="1" w:unhideWhenUsed="1"/>
     <w:lsdException w:name="Table Elegant" w:semiHidden="1" w:unhideWhenUsed="1"/>
     <w:lsdException w:name="Table Professional" w:semiHidden="1" w:unhideWhenUsed="1"/>
+    <w:lsdException w:name="Table Subtle 1" w:semiHidden="1" w:unhideWhenUsed="1"/>
     <w:lsdException w:name="Table Subtle 2" w:semiHidden="1" w:unhideWhenUsed="1"/>
     <w:lsdException w:name="Table Web 1" w:semiHidden="1" w:unhideWhenUsed="1"/>
+    <w:lsdException w:name="Table Web 2" w:semiHidden="1" w:unhideWhenUsed="1"/>
+    <w:lsdException w:name="Table Web 3" w:semiHidden="1" w:unhideWhenUsed="1"/>
     <w:lsdException w:name="Balloon Text" w:semiHidden="1" w:unhideWhenUsed="1"/>
     <w:lsdException w:name="Table Grid" w:uiPriority="39"/>
     <w:lsdException w:name="Table Theme" w:semiHidden="1" w:unhideWhenUsed="1"/>

</xml_diff>

<commit_message>
ultimos detalles y diagrama de componentes
</commit_message>
<xml_diff>
--- a/docs/Taller practico.docx
+++ b/docs/Taller practico.docx
@@ -1512,7 +1512,27 @@
           <w:sz w:val="20"/>
           <w:szCs w:val="20"/>
         </w:rPr>
-        <w:t>en su totalidad de la otra clase, por ende se utiliza la relación de composición</w:t>
+        <w:t xml:space="preserve">en su totalidad de la otra clase, por </w:t>
+      </w:r>
+      <w:proofErr w:type="gramStart"/>
+      <w:r>
+        <w:rPr>
+          <w:rFonts w:ascii="Aptos" w:eastAsia="Aptos" w:hAnsi="Aptos" w:cs="Aptos"/>
+          <w:color w:val="202122"/>
+          <w:sz w:val="20"/>
+          <w:szCs w:val="20"/>
+        </w:rPr>
+        <w:t>ende</w:t>
+      </w:r>
+      <w:proofErr w:type="gramEnd"/>
+      <w:r>
+        <w:rPr>
+          <w:rFonts w:ascii="Aptos" w:eastAsia="Aptos" w:hAnsi="Aptos" w:cs="Aptos"/>
+          <w:color w:val="202122"/>
+          <w:sz w:val="20"/>
+          <w:szCs w:val="20"/>
+        </w:rPr>
+        <w:t xml:space="preserve"> se utiliza la relación de composición</w:t>
       </w:r>
     </w:p>
     <w:p>
@@ -1665,8 +1685,19 @@
                 <w:sz w:val="20"/>
                 <w:szCs w:val="20"/>
               </w:rPr>
-              <w:t>Estudiante – Prestamo</w:t>
-            </w:r>
+              <w:t xml:space="preserve">Estudiante – </w:t>
+            </w:r>
+            <w:proofErr w:type="spellStart"/>
+            <w:r>
+              <w:rPr>
+                <w:rFonts w:ascii="Aptos" w:eastAsia="Aptos" w:hAnsi="Aptos" w:cs="Aptos"/>
+                <w:color w:val="202122"/>
+                <w:sz w:val="20"/>
+                <w:szCs w:val="20"/>
+              </w:rPr>
+              <w:t>Prestamo</w:t>
+            </w:r>
+            <w:proofErr w:type="spellEnd"/>
           </w:p>
         </w:tc>
         <w:tc>
@@ -1894,14 +1925,25 @@
             <w:pPr>
               <w:spacing w:after="100"/>
             </w:pPr>
-            <w:r>
-              <w:rPr>
-                <w:rFonts w:ascii="Aptos" w:eastAsia="Aptos" w:hAnsi="Aptos" w:cs="Aptos"/>
-                <w:color w:val="202122"/>
-                <w:sz w:val="20"/>
-                <w:szCs w:val="20"/>
-              </w:rPr>
-              <w:t>Prestamo – Ejemplar</w:t>
+            <w:proofErr w:type="spellStart"/>
+            <w:r>
+              <w:rPr>
+                <w:rFonts w:ascii="Aptos" w:eastAsia="Aptos" w:hAnsi="Aptos" w:cs="Aptos"/>
+                <w:color w:val="202122"/>
+                <w:sz w:val="20"/>
+                <w:szCs w:val="20"/>
+              </w:rPr>
+              <w:t>Prestamo</w:t>
+            </w:r>
+            <w:proofErr w:type="spellEnd"/>
+            <w:r>
+              <w:rPr>
+                <w:rFonts w:ascii="Aptos" w:eastAsia="Aptos" w:hAnsi="Aptos" w:cs="Aptos"/>
+                <w:color w:val="202122"/>
+                <w:sz w:val="20"/>
+                <w:szCs w:val="20"/>
+              </w:rPr>
+              <w:t xml:space="preserve"> – Ejemplar</w:t>
             </w:r>
           </w:p>
         </w:tc>
@@ -2175,6 +2217,7 @@
             <w:pPr>
               <w:spacing w:after="100"/>
             </w:pPr>
+            <w:proofErr w:type="spellStart"/>
             <w:r>
               <w:rPr>
                 <w:rFonts w:ascii="Aptos" w:eastAsia="Aptos" w:hAnsi="Aptos" w:cs="Aptos"/>
@@ -2183,8 +2226,29 @@
                 <w:szCs w:val="20"/>
               </w:rPr>
               <w:lastRenderedPageBreak/>
-              <w:t>Prestamo – Renovacion</w:t>
-            </w:r>
+              <w:t>Prestamo</w:t>
+            </w:r>
+            <w:proofErr w:type="spellEnd"/>
+            <w:r>
+              <w:rPr>
+                <w:rFonts w:ascii="Aptos" w:eastAsia="Aptos" w:hAnsi="Aptos" w:cs="Aptos"/>
+                <w:color w:val="202122"/>
+                <w:sz w:val="20"/>
+                <w:szCs w:val="20"/>
+              </w:rPr>
+              <w:t xml:space="preserve"> – </w:t>
+            </w:r>
+            <w:proofErr w:type="spellStart"/>
+            <w:r>
+              <w:rPr>
+                <w:rFonts w:ascii="Aptos" w:eastAsia="Aptos" w:hAnsi="Aptos" w:cs="Aptos"/>
+                <w:color w:val="202122"/>
+                <w:sz w:val="20"/>
+                <w:szCs w:val="20"/>
+              </w:rPr>
+              <w:t>Renovacion</w:t>
+            </w:r>
+            <w:proofErr w:type="spellEnd"/>
           </w:p>
         </w:tc>
         <w:tc>
@@ -2555,8 +2619,39 @@
           <w:sz w:val="20"/>
           <w:szCs w:val="20"/>
         </w:rPr>
-        <w:t>La renovación es parte exclusiva del historial interno del préstamo R11. Si el préstamo desaparece, sus renovaciones también lo harán, siendo una relacion de composicion</w:t>
-      </w:r>
+        <w:t xml:space="preserve">La renovación es parte exclusiva del historial interno del préstamo R11. Si el préstamo desaparece, sus renovaciones también lo harán, siendo una </w:t>
+      </w:r>
+      <w:proofErr w:type="spellStart"/>
+      <w:r>
+        <w:rPr>
+          <w:rFonts w:ascii="Aptos" w:eastAsia="Aptos" w:hAnsi="Aptos" w:cs="Aptos"/>
+          <w:color w:val="202122"/>
+          <w:sz w:val="20"/>
+          <w:szCs w:val="20"/>
+        </w:rPr>
+        <w:t>relacion</w:t>
+      </w:r>
+      <w:proofErr w:type="spellEnd"/>
+      <w:r>
+        <w:rPr>
+          <w:rFonts w:ascii="Aptos" w:eastAsia="Aptos" w:hAnsi="Aptos" w:cs="Aptos"/>
+          <w:color w:val="202122"/>
+          <w:sz w:val="20"/>
+          <w:szCs w:val="20"/>
+        </w:rPr>
+        <w:t xml:space="preserve"> de </w:t>
+      </w:r>
+      <w:proofErr w:type="spellStart"/>
+      <w:r>
+        <w:rPr>
+          <w:rFonts w:ascii="Aptos" w:eastAsia="Aptos" w:hAnsi="Aptos" w:cs="Aptos"/>
+          <w:color w:val="202122"/>
+          <w:sz w:val="20"/>
+          <w:szCs w:val="20"/>
+        </w:rPr>
+        <w:t>composicion</w:t>
+      </w:r>
+      <w:proofErr w:type="spellEnd"/>
     </w:p>
     <w:p/>
     <w:p>
@@ -2646,7 +2741,31 @@
           <w:sz w:val="20"/>
           <w:szCs w:val="20"/>
         </w:rPr>
-        <w:t>¿Estudiante es realmente un tipo de Usuario dentro de SmartLibrary? Justifique.</w:t>
+        <w:t xml:space="preserve">¿Estudiante es realmente un tipo de Usuario dentro de </w:t>
+      </w:r>
+      <w:proofErr w:type="spellStart"/>
+      <w:r>
+        <w:rPr>
+          <w:rFonts w:ascii="Aptos" w:eastAsia="Aptos" w:hAnsi="Aptos" w:cs="Aptos"/>
+          <w:b/>
+          <w:bCs/>
+          <w:color w:val="202122"/>
+          <w:sz w:val="20"/>
+          <w:szCs w:val="20"/>
+        </w:rPr>
+        <w:t>SmartLibrary</w:t>
+      </w:r>
+      <w:proofErr w:type="spellEnd"/>
+      <w:r>
+        <w:rPr>
+          <w:rFonts w:ascii="Aptos" w:eastAsia="Aptos" w:hAnsi="Aptos" w:cs="Aptos"/>
+          <w:b/>
+          <w:bCs/>
+          <w:color w:val="202122"/>
+          <w:sz w:val="20"/>
+          <w:szCs w:val="20"/>
+        </w:rPr>
+        <w:t>? Justifique.</w:t>
       </w:r>
     </w:p>
     <w:p>
@@ -2743,7 +2862,47 @@
           <w:szCs w:val="20"/>
         </w:rPr>
         <w:lastRenderedPageBreak/>
-        <w:t>datos propios: codigoEstudiantil y programaAcademico. Sin la superclase, estos atributos comunes se repetirían y habría que mantenerlos po</w:t>
+        <w:t xml:space="preserve">datos propios: </w:t>
+      </w:r>
+      <w:proofErr w:type="spellStart"/>
+      <w:r>
+        <w:rPr>
+          <w:rFonts w:ascii="Aptos" w:eastAsia="Aptos" w:hAnsi="Aptos" w:cs="Aptos"/>
+          <w:color w:val="202122"/>
+          <w:sz w:val="20"/>
+          <w:szCs w:val="20"/>
+        </w:rPr>
+        <w:t>codigoEstudiantil</w:t>
+      </w:r>
+      <w:proofErr w:type="spellEnd"/>
+      <w:r>
+        <w:rPr>
+          <w:rFonts w:ascii="Aptos" w:eastAsia="Aptos" w:hAnsi="Aptos" w:cs="Aptos"/>
+          <w:color w:val="202122"/>
+          <w:sz w:val="20"/>
+          <w:szCs w:val="20"/>
+        </w:rPr>
+        <w:t xml:space="preserve"> y </w:t>
+      </w:r>
+      <w:proofErr w:type="spellStart"/>
+      <w:r>
+        <w:rPr>
+          <w:rFonts w:ascii="Aptos" w:eastAsia="Aptos" w:hAnsi="Aptos" w:cs="Aptos"/>
+          <w:color w:val="202122"/>
+          <w:sz w:val="20"/>
+          <w:szCs w:val="20"/>
+        </w:rPr>
+        <w:t>programaAcademico</w:t>
+      </w:r>
+      <w:proofErr w:type="spellEnd"/>
+      <w:r>
+        <w:rPr>
+          <w:rFonts w:ascii="Aptos" w:eastAsia="Aptos" w:hAnsi="Aptos" w:cs="Aptos"/>
+          <w:color w:val="202122"/>
+          <w:sz w:val="20"/>
+          <w:szCs w:val="20"/>
+        </w:rPr>
+        <w:t>. Sin la superclase, estos atributos comunes se repetirían y habría que mantenerlos po</w:t>
       </w:r>
       <w:r>
         <w:rPr>
@@ -2855,7 +3014,27 @@
           <w:sz w:val="20"/>
           <w:szCs w:val="20"/>
         </w:rPr>
-        <w:t>ereda esos atributos y agrega codigoEmpleado y turno, que lo diferencian del estudiante por su rol de trabajador de la biblioteca.</w:t>
+        <w:t xml:space="preserve">ereda esos atributos y agrega </w:t>
+      </w:r>
+      <w:proofErr w:type="spellStart"/>
+      <w:r>
+        <w:rPr>
+          <w:rFonts w:ascii="Aptos" w:eastAsia="Aptos" w:hAnsi="Aptos" w:cs="Aptos"/>
+          <w:color w:val="202122"/>
+          <w:sz w:val="20"/>
+          <w:szCs w:val="20"/>
+        </w:rPr>
+        <w:t>codigoEmpleado</w:t>
+      </w:r>
+      <w:proofErr w:type="spellEnd"/>
+      <w:r>
+        <w:rPr>
+          <w:rFonts w:ascii="Aptos" w:eastAsia="Aptos" w:hAnsi="Aptos" w:cs="Aptos"/>
+          <w:color w:val="202122"/>
+          <w:sz w:val="20"/>
+          <w:szCs w:val="20"/>
+        </w:rPr>
+        <w:t xml:space="preserve"> y turno, que lo diferencian del estudiante por su rol de trabajador de la biblioteca.</w:t>
       </w:r>
     </w:p>
     <w:p>
@@ -3205,14 +3384,25 @@
         <w:shd w:val="clear" w:color="auto" w:fill="FFFFFF" w:themeFill="background1"/>
         <w:spacing w:after="100" w:line="230" w:lineRule="auto"/>
       </w:pPr>
-      <w:r>
-        <w:rPr>
-          <w:rFonts w:ascii="Aptos" w:eastAsia="Aptos" w:hAnsi="Aptos" w:cs="Aptos"/>
-          <w:color w:val="202122"/>
-          <w:sz w:val="20"/>
-          <w:szCs w:val="20"/>
-        </w:rPr>
-        <w:t>SmartLibrary necesita que determinados objetos puedan recibir notificaciones. En este bloque no diseñaremos todavía patrones ni principios SOLID. Solo queremos expresar un contrato de comportamiento.</w:t>
+      <w:proofErr w:type="spellStart"/>
+      <w:r>
+        <w:rPr>
+          <w:rFonts w:ascii="Aptos" w:eastAsia="Aptos" w:hAnsi="Aptos" w:cs="Aptos"/>
+          <w:color w:val="202122"/>
+          <w:sz w:val="20"/>
+          <w:szCs w:val="20"/>
+        </w:rPr>
+        <w:t>SmartLibrary</w:t>
+      </w:r>
+      <w:proofErr w:type="spellEnd"/>
+      <w:r>
+        <w:rPr>
+          <w:rFonts w:ascii="Aptos" w:eastAsia="Aptos" w:hAnsi="Aptos" w:cs="Aptos"/>
+          <w:color w:val="202122"/>
+          <w:sz w:val="20"/>
+          <w:szCs w:val="20"/>
+        </w:rPr>
+        <w:t xml:space="preserve"> necesita que determinados objetos puedan recibir notificaciones. En este bloque no diseñaremos todavía patrones ni principios SOLID. Solo queremos expresar un contrato de comportamiento.</w:t>
       </w:r>
     </w:p>
     <w:p>
@@ -3221,6 +3411,7 @@
         <w:spacing w:after="100" w:line="207" w:lineRule="auto"/>
         <w:ind w:left="360"/>
       </w:pPr>
+      <w:proofErr w:type="spellStart"/>
       <w:r>
         <w:rPr>
           <w:rFonts w:ascii="Consolas" w:eastAsia="Consolas" w:hAnsi="Consolas" w:cs="Consolas"/>
@@ -3228,11 +3419,9 @@
           <w:sz w:val="18"/>
           <w:szCs w:val="18"/>
         </w:rPr>
-        <w:t>public interface Notificable {</w:t>
-      </w:r>
-      <w:r>
-        <w:br/>
-      </w:r>
+        <w:t>public</w:t>
+      </w:r>
+      <w:proofErr w:type="spellEnd"/>
       <w:r>
         <w:rPr>
           <w:rFonts w:ascii="Consolas" w:eastAsia="Consolas" w:hAnsi="Consolas" w:cs="Consolas"/>
@@ -3240,11 +3429,9 @@
           <w:sz w:val="18"/>
           <w:szCs w:val="18"/>
         </w:rPr>
-        <w:t xml:space="preserve">    void notificar(String mensaje);</w:t>
-      </w:r>
-      <w:r>
-        <w:br/>
-      </w:r>
+        <w:t xml:space="preserve"> interface </w:t>
+      </w:r>
+      <w:proofErr w:type="spellStart"/>
       <w:r>
         <w:rPr>
           <w:rFonts w:ascii="Consolas" w:eastAsia="Consolas" w:hAnsi="Consolas" w:cs="Consolas"/>
@@ -3252,6 +3439,60 @@
           <w:sz w:val="18"/>
           <w:szCs w:val="18"/>
         </w:rPr>
+        <w:t>Notificable</w:t>
+      </w:r>
+      <w:proofErr w:type="spellEnd"/>
+      <w:r>
+        <w:rPr>
+          <w:rFonts w:ascii="Consolas" w:eastAsia="Consolas" w:hAnsi="Consolas" w:cs="Consolas"/>
+          <w:color w:val="202122"/>
+          <w:sz w:val="18"/>
+          <w:szCs w:val="18"/>
+        </w:rPr>
+        <w:t xml:space="preserve"> {</w:t>
+      </w:r>
+      <w:r>
+        <w:br/>
+      </w:r>
+      <w:r>
+        <w:rPr>
+          <w:rFonts w:ascii="Consolas" w:eastAsia="Consolas" w:hAnsi="Consolas" w:cs="Consolas"/>
+          <w:color w:val="202122"/>
+          <w:sz w:val="18"/>
+          <w:szCs w:val="18"/>
+        </w:rPr>
+        <w:t xml:space="preserve">    void </w:t>
+      </w:r>
+      <w:proofErr w:type="gramStart"/>
+      <w:r>
+        <w:rPr>
+          <w:rFonts w:ascii="Consolas" w:eastAsia="Consolas" w:hAnsi="Consolas" w:cs="Consolas"/>
+          <w:color w:val="202122"/>
+          <w:sz w:val="18"/>
+          <w:szCs w:val="18"/>
+        </w:rPr>
+        <w:t>notificar(</w:t>
+      </w:r>
+      <w:proofErr w:type="gramEnd"/>
+      <w:r>
+        <w:rPr>
+          <w:rFonts w:ascii="Consolas" w:eastAsia="Consolas" w:hAnsi="Consolas" w:cs="Consolas"/>
+          <w:color w:val="202122"/>
+          <w:sz w:val="18"/>
+          <w:szCs w:val="18"/>
+        </w:rPr>
+        <w:t>String mensaje);</w:t>
+      </w:r>
+      <w:r>
+        <w:br/>
+      </w:r>
+      <w:r>
+        <w:rPr>
+          <w:rFonts w:ascii="Consolas" w:eastAsia="Consolas" w:hAnsi="Consolas" w:cs="Consolas"/>
+          <w:color w:val="202122"/>
+          <w:sz w:val="18"/>
+          <w:szCs w:val="18"/>
+        </w:rPr>
         <w:t>}</w:t>
       </w:r>
     </w:p>
@@ -3284,7 +3525,31 @@
           <w:sz w:val="20"/>
           <w:szCs w:val="20"/>
         </w:rPr>
-        <w:t>Decidan qué clase o clases de su diseño deberían implementar Notificable y justifiquen la decisión.</w:t>
+        <w:t xml:space="preserve">Decidan qué clase o clases de su diseño deberían implementar </w:t>
+      </w:r>
+      <w:proofErr w:type="spellStart"/>
+      <w:r>
+        <w:rPr>
+          <w:rFonts w:ascii="Aptos" w:eastAsia="Aptos" w:hAnsi="Aptos" w:cs="Aptos"/>
+          <w:b/>
+          <w:bCs/>
+          <w:color w:val="202122"/>
+          <w:sz w:val="20"/>
+          <w:szCs w:val="20"/>
+        </w:rPr>
+        <w:t>Notificable</w:t>
+      </w:r>
+      <w:proofErr w:type="spellEnd"/>
+      <w:r>
+        <w:rPr>
+          <w:rFonts w:ascii="Aptos" w:eastAsia="Aptos" w:hAnsi="Aptos" w:cs="Aptos"/>
+          <w:b/>
+          <w:bCs/>
+          <w:color w:val="202122"/>
+          <w:sz w:val="20"/>
+          <w:szCs w:val="20"/>
+        </w:rPr>
+        <w:t xml:space="preserve"> y justifiquen la decisión.</w:t>
       </w:r>
     </w:p>
     <w:p>
@@ -3313,7 +3578,27 @@
           <w:sz w:val="20"/>
           <w:szCs w:val="20"/>
         </w:rPr>
-        <w:t xml:space="preserve">La clase Estudiantes debería implementar Notificable, pues es quien tiene </w:t>
+        <w:t xml:space="preserve">La clase Estudiantes debería implementar </w:t>
+      </w:r>
+      <w:proofErr w:type="spellStart"/>
+      <w:r>
+        <w:rPr>
+          <w:rFonts w:ascii="Aptos" w:eastAsia="Aptos" w:hAnsi="Aptos" w:cs="Aptos"/>
+          <w:color w:val="202122"/>
+          <w:sz w:val="20"/>
+          <w:szCs w:val="20"/>
+        </w:rPr>
+        <w:t>Notificable</w:t>
+      </w:r>
+      <w:proofErr w:type="spellEnd"/>
+      <w:r>
+        <w:rPr>
+          <w:rFonts w:ascii="Aptos" w:eastAsia="Aptos" w:hAnsi="Aptos" w:cs="Aptos"/>
+          <w:color w:val="202122"/>
+          <w:sz w:val="20"/>
+          <w:szCs w:val="20"/>
+        </w:rPr>
+        <w:t xml:space="preserve">, pues es quien tiene </w:t>
       </w:r>
       <w:r>
         <w:rPr>
@@ -3580,7 +3865,31 @@
           <w:sz w:val="20"/>
           <w:szCs w:val="20"/>
         </w:rPr>
-        <w:t>Explique qué garantiza el contrato Notificable y qué NO especifica</w:t>
+        <w:t xml:space="preserve">Explique qué garantiza el contrato </w:t>
+      </w:r>
+      <w:proofErr w:type="spellStart"/>
+      <w:r>
+        <w:rPr>
+          <w:rFonts w:ascii="Aptos" w:eastAsia="Aptos" w:hAnsi="Aptos" w:cs="Aptos"/>
+          <w:b/>
+          <w:bCs/>
+          <w:color w:val="202122"/>
+          <w:sz w:val="20"/>
+          <w:szCs w:val="20"/>
+        </w:rPr>
+        <w:t>Notificable</w:t>
+      </w:r>
+      <w:proofErr w:type="spellEnd"/>
+      <w:r>
+        <w:rPr>
+          <w:rFonts w:ascii="Aptos" w:eastAsia="Aptos" w:hAnsi="Aptos" w:cs="Aptos"/>
+          <w:b/>
+          <w:bCs/>
+          <w:color w:val="202122"/>
+          <w:sz w:val="20"/>
+          <w:szCs w:val="20"/>
+        </w:rPr>
+        <w:t xml:space="preserve"> y qué NO especifica</w:t>
       </w:r>
     </w:p>
     <w:p>
@@ -3601,7 +3910,27 @@
           <w:sz w:val="20"/>
           <w:szCs w:val="20"/>
         </w:rPr>
-        <w:t>La interfaz Notificable garantiza que toda clase que la implemente deba tener obligatoriamente un método notificar</w:t>
+        <w:t xml:space="preserve">La interfaz </w:t>
+      </w:r>
+      <w:proofErr w:type="spellStart"/>
+      <w:r>
+        <w:rPr>
+          <w:rFonts w:ascii="Aptos" w:eastAsia="Aptos" w:hAnsi="Aptos" w:cs="Aptos"/>
+          <w:color w:val="202122"/>
+          <w:sz w:val="20"/>
+          <w:szCs w:val="20"/>
+        </w:rPr>
+        <w:t>Notificable</w:t>
+      </w:r>
+      <w:proofErr w:type="spellEnd"/>
+      <w:r>
+        <w:rPr>
+          <w:rFonts w:ascii="Aptos" w:eastAsia="Aptos" w:hAnsi="Aptos" w:cs="Aptos"/>
+          <w:color w:val="202122"/>
+          <w:sz w:val="20"/>
+          <w:szCs w:val="20"/>
+        </w:rPr>
+        <w:t xml:space="preserve"> garantiza que toda clase que la implemente deba tener obligatoriamente un método notificar</w:t>
       </w:r>
       <w:r>
         <w:rPr>
@@ -3806,7 +4135,25 @@
                 <w:sz w:val="20"/>
                 <w:szCs w:val="20"/>
               </w:rPr>
-              <w:t>¿Qué promete una clase que implementa Notificable?</w:t>
+              <w:t xml:space="preserve">¿Qué promete una clase que implementa </w:t>
+            </w:r>
+            <w:proofErr w:type="spellStart"/>
+            <w:r>
+              <w:rPr>
+                <w:rFonts w:ascii="Aptos" w:eastAsia="Aptos" w:hAnsi="Aptos" w:cs="Aptos"/>
+                <w:sz w:val="20"/>
+                <w:szCs w:val="20"/>
+              </w:rPr>
+              <w:t>Notificable</w:t>
+            </w:r>
+            <w:proofErr w:type="spellEnd"/>
+            <w:r>
+              <w:rPr>
+                <w:rFonts w:ascii="Aptos" w:eastAsia="Aptos" w:hAnsi="Aptos" w:cs="Aptos"/>
+                <w:sz w:val="20"/>
+                <w:szCs w:val="20"/>
+              </w:rPr>
+              <w:t>?</w:t>
             </w:r>
           </w:p>
         </w:tc>
@@ -3840,7 +4187,25 @@
                 <w:sz w:val="20"/>
                 <w:szCs w:val="20"/>
               </w:rPr>
-              <w:t xml:space="preserve">Toda clase que implemente Notificable se compromete a garantizar que sus objetos puedan recibir un mensaje mediante la operación notificar. </w:t>
+              <w:t xml:space="preserve">Toda clase que implemente </w:t>
+            </w:r>
+            <w:proofErr w:type="spellStart"/>
+            <w:r>
+              <w:rPr>
+                <w:rFonts w:ascii="Aptos" w:eastAsia="Aptos" w:hAnsi="Aptos" w:cs="Aptos"/>
+                <w:sz w:val="20"/>
+                <w:szCs w:val="20"/>
+              </w:rPr>
+              <w:t>Notificable</w:t>
+            </w:r>
+            <w:proofErr w:type="spellEnd"/>
+            <w:r>
+              <w:rPr>
+                <w:rFonts w:ascii="Aptos" w:eastAsia="Aptos" w:hAnsi="Aptos" w:cs="Aptos"/>
+                <w:sz w:val="20"/>
+                <w:szCs w:val="20"/>
+              </w:rPr>
+              <w:t xml:space="preserve"> se compromete a garantizar que sus objetos puedan recibir un mensaje mediante la operación notificar. </w:t>
             </w:r>
             <w:r>
               <w:rPr>
@@ -3967,7 +4332,25 @@
                 <w:sz w:val="20"/>
                 <w:szCs w:val="20"/>
               </w:rPr>
-              <w:t>¿Puede una clase heredar de Usuario e implementar Notificable al mismo tiempo? Explique.</w:t>
+              <w:t xml:space="preserve">¿Puede una clase heredar de Usuario e implementar </w:t>
+            </w:r>
+            <w:proofErr w:type="spellStart"/>
+            <w:r>
+              <w:rPr>
+                <w:rFonts w:ascii="Aptos" w:eastAsia="Aptos" w:hAnsi="Aptos" w:cs="Aptos"/>
+                <w:sz w:val="20"/>
+                <w:szCs w:val="20"/>
+              </w:rPr>
+              <w:t>Notificable</w:t>
+            </w:r>
+            <w:proofErr w:type="spellEnd"/>
+            <w:r>
+              <w:rPr>
+                <w:rFonts w:ascii="Aptos" w:eastAsia="Aptos" w:hAnsi="Aptos" w:cs="Aptos"/>
+                <w:sz w:val="20"/>
+                <w:szCs w:val="20"/>
+              </w:rPr>
+              <w:t xml:space="preserve"> al mismo tiempo? Explique.</w:t>
             </w:r>
           </w:p>
         </w:tc>
@@ -4246,7 +4629,29 @@
                 <w:szCs w:val="20"/>
                 <w:lang w:eastAsia="es-CO"/>
               </w:rPr>
-              <w:t> Usuario, Estudiante, Bibliotecario, Notificable </w:t>
+              <w:t xml:space="preserve"> Usuario, Estudiante, Bibliotecario, </w:t>
+            </w:r>
+            <w:proofErr w:type="spellStart"/>
+            <w:r>
+              <w:rPr>
+                <w:rFonts w:ascii="Aptos" w:eastAsia="Times New Roman" w:hAnsi="Aptos" w:cs="Segoe UI"/>
+                <w:color w:val="202122"/>
+                <w:sz w:val="20"/>
+                <w:szCs w:val="20"/>
+                <w:lang w:eastAsia="es-CO"/>
+              </w:rPr>
+              <w:t>Notificable</w:t>
+            </w:r>
+            <w:proofErr w:type="spellEnd"/>
+            <w:r>
+              <w:rPr>
+                <w:rFonts w:ascii="Aptos" w:eastAsia="Times New Roman" w:hAnsi="Aptos" w:cs="Segoe UI"/>
+                <w:color w:val="202122"/>
+                <w:sz w:val="20"/>
+                <w:szCs w:val="20"/>
+                <w:lang w:eastAsia="es-CO"/>
+              </w:rPr>
+              <w:t> </w:t>
             </w:r>
           </w:p>
         </w:tc>
@@ -4466,7 +4871,51 @@
                 <w:szCs w:val="20"/>
                 <w:lang w:eastAsia="es-CO"/>
               </w:rPr>
-              <w:t xml:space="preserve"> Prestamo, Renovacion </w:t>
+              <w:t> </w:t>
+            </w:r>
+            <w:proofErr w:type="spellStart"/>
+            <w:r>
+              <w:rPr>
+                <w:rFonts w:ascii="Aptos" w:eastAsia="Times New Roman" w:hAnsi="Aptos" w:cs="Segoe UI"/>
+                <w:color w:val="202122"/>
+                <w:sz w:val="20"/>
+                <w:szCs w:val="20"/>
+                <w:lang w:eastAsia="es-CO"/>
+              </w:rPr>
+              <w:t>Prestamo</w:t>
+            </w:r>
+            <w:proofErr w:type="spellEnd"/>
+            <w:r>
+              <w:rPr>
+                <w:rFonts w:ascii="Aptos" w:eastAsia="Times New Roman" w:hAnsi="Aptos" w:cs="Segoe UI"/>
+                <w:color w:val="202122"/>
+                <w:sz w:val="20"/>
+                <w:szCs w:val="20"/>
+                <w:lang w:eastAsia="es-CO"/>
+              </w:rPr>
+              <w:t xml:space="preserve">, </w:t>
+            </w:r>
+            <w:proofErr w:type="spellStart"/>
+            <w:r>
+              <w:rPr>
+                <w:rFonts w:ascii="Aptos" w:eastAsia="Times New Roman" w:hAnsi="Aptos" w:cs="Segoe UI"/>
+                <w:color w:val="202122"/>
+                <w:sz w:val="20"/>
+                <w:szCs w:val="20"/>
+                <w:lang w:eastAsia="es-CO"/>
+              </w:rPr>
+              <w:t>Renovacion</w:t>
+            </w:r>
+            <w:proofErr w:type="spellEnd"/>
+            <w:r>
+              <w:rPr>
+                <w:rFonts w:ascii="Aptos" w:eastAsia="Times New Roman" w:hAnsi="Aptos" w:cs="Segoe UI"/>
+                <w:color w:val="202122"/>
+                <w:sz w:val="20"/>
+                <w:szCs w:val="20"/>
+                <w:lang w:eastAsia="es-CO"/>
+              </w:rPr>
+              <w:t xml:space="preserve"> </w:t>
             </w:r>
           </w:p>
         </w:tc>
@@ -4853,6 +5302,71 @@
         <w:t>Diagrama de componentes</w:t>
       </w:r>
     </w:p>
+    <w:p>
+      <w:pPr>
+        <w:spacing w:after="0" w:line="240" w:lineRule="auto"/>
+        <w:rPr>
+          <w:rFonts w:ascii="Times New Roman" w:eastAsia="Times New Roman" w:hAnsi="Times New Roman" w:cs="Times New Roman"/>
+          <w:lang w:val="es-CO" w:eastAsia="es-CO"/>
+        </w:rPr>
+      </w:pPr>
+      <w:r>
+        <w:rPr>
+          <w:rFonts w:ascii="Times New Roman" w:eastAsia="Times New Roman" w:hAnsi="Times New Roman" w:cs="Times New Roman"/>
+          <w:noProof/>
+          <w:lang w:val="es-CO" w:eastAsia="es-CO"/>
+        </w:rPr>
+        <w:drawing>
+          <wp:inline distT="0" distB="0" distL="0" distR="0" wp14:anchorId="46AFEB1E" wp14:editId="77CD6590">
+            <wp:extent cx="5731510" cy="2527935"/>
+            <wp:effectExtent l="0" t="0" r="2540" b="5715"/>
+            <wp:docPr id="2" name="Imagen 2"/>
+            <wp:cNvGraphicFramePr>
+              <a:graphicFrameLocks xmlns:a="http://schemas.openxmlformats.org/drawingml/2006/main" noChangeAspect="1"/>
+            </wp:cNvGraphicFramePr>
+            <a:graphic xmlns:a="http://schemas.openxmlformats.org/drawingml/2006/main">
+              <a:graphicData uri="http://schemas.openxmlformats.org/drawingml/2006/picture">
+                <pic:pic xmlns:pic="http://schemas.openxmlformats.org/drawingml/2006/picture">
+                  <pic:nvPicPr>
+                    <pic:cNvPr id="0" name="Picture 1"/>
+                    <pic:cNvPicPr>
+                      <a:picLocks noChangeAspect="1" noChangeArrowheads="1"/>
+                    </pic:cNvPicPr>
+                  </pic:nvPicPr>
+                  <pic:blipFill>
+                    <a:blip r:embed="rId8">
+                      <a:extLst>
+                        <a:ext uri="{28A0092B-C50C-407E-A947-70E740481C1C}">
+                          <a14:useLocalDpi xmlns:a14="http://schemas.microsoft.com/office/drawing/2010/main" val="0"/>
+                        </a:ext>
+                      </a:extLst>
+                    </a:blip>
+                    <a:srcRect/>
+                    <a:stretch>
+                      <a:fillRect/>
+                    </a:stretch>
+                  </pic:blipFill>
+                  <pic:spPr bwMode="auto">
+                    <a:xfrm>
+                      <a:off x="0" y="0"/>
+                      <a:ext cx="5731510" cy="2527935"/>
+                    </a:xfrm>
+                    <a:prstGeom prst="rect">
+                      <a:avLst/>
+                    </a:prstGeom>
+                    <a:noFill/>
+                    <a:ln>
+                      <a:noFill/>
+                    </a:ln>
+                  </pic:spPr>
+                </pic:pic>
+              </a:graphicData>
+            </a:graphic>
+          </wp:inline>
+        </w:drawing>
+      </w:r>
+    </w:p>
+    <w:p/>
     <w:sectPr>
       <w:pgSz w:w="11906" w:h="16838"/>
       <w:pgMar w:top="1440" w:right="1440" w:bottom="1440" w:left="1440" w:header="720" w:footer="720" w:gutter="0"/>

</xml_diff>